<commit_message>
Rename demo data to vendor parts and ECO/ECR change orders
Gallery images renamed to vendor names (Danfoss, Donaldson, Husco,
Parker, Tecnord); prompt files renamed to ECO-ECR_no.*. Untrack
generated DOC1_RevB* outputs.

Co-Authored-By: Claude Opus 5 <noreply@anthropic.com>
Claude-Session: https://claude.ai/code/session_01MyzzNgGyY4ZeLocDqxa4Kp
</commit_message>
<xml_diff>
--- a/current_database/DOC1_RevA.docx
+++ b/current_database/DOC1_RevA.docx
@@ -34,27 +34,28 @@
         <w:rPr>
           <w:noProof/>
         </w:rPr>
+        <w:t>The Husco regulated valve</w:t>
+      </w:r>
+      <w:r>
+        <w:t xml:space="preserve"> is a component that </w:t>
+      </w:r>
+      <w:r>
+        <w:rPr>
+          <w:noProof/>
+        </w:rPr>
         <w:drawing>
-          <wp:anchor distT="0" distB="0" distL="114300" distR="114300" simplePos="0" relativeHeight="251657728" behindDoc="1" locked="0" layoutInCell="1" allowOverlap="1" wp14:anchorId="5919524F" wp14:editId="060B2C5B">
+          <wp:anchor distT="0" distB="0" distL="114300" distR="114300" simplePos="0" relativeHeight="251658240" behindDoc="0" locked="0" layoutInCell="1" allowOverlap="1" wp14:anchorId="73D780FB" wp14:editId="107CDB83">
             <wp:simplePos x="0" y="0"/>
             <wp:positionH relativeFrom="column">
-              <wp:posOffset>3517717</wp:posOffset>
+              <wp:posOffset>3261360</wp:posOffset>
             </wp:positionH>
             <wp:positionV relativeFrom="paragraph">
-              <wp:posOffset>62929</wp:posOffset>
+              <wp:posOffset>-1905</wp:posOffset>
             </wp:positionV>
-            <wp:extent cx="2649220" cy="3308350"/>
+            <wp:extent cx="2682240" cy="3672840"/>
             <wp:effectExtent l="0" t="0" r="0" b="0"/>
-            <wp:wrapTight wrapText="bothSides">
-              <wp:wrapPolygon edited="0">
-                <wp:start x="0" y="0"/>
-                <wp:lineTo x="0" y="21517"/>
-                <wp:lineTo x="21434" y="21517"/>
-                <wp:lineTo x="21434" y="0"/>
-                <wp:lineTo x="0" y="0"/>
-              </wp:wrapPolygon>
-            </wp:wrapTight>
-            <wp:docPr id="959771770" name="Picture 1"/>
+            <wp:wrapSquare wrapText="bothSides"/>
+            <wp:docPr id="955633067" name="Picture 1"/>
             <wp:cNvGraphicFramePr>
               <a:graphicFrameLocks xmlns:a="http://schemas.openxmlformats.org/drawingml/2006/main" noChangeAspect="1"/>
             </wp:cNvGraphicFramePr>
@@ -62,51 +63,41 @@
               <a:graphicData uri="http://schemas.openxmlformats.org/drawingml/2006/picture">
                 <pic:pic xmlns:pic="http://schemas.openxmlformats.org/drawingml/2006/picture">
                   <pic:nvPicPr>
-                    <pic:cNvPr id="0" name="Picture 1"/>
-                    <pic:cNvPicPr>
-                      <a:picLocks noChangeAspect="1" noChangeArrowheads="1"/>
-                    </pic:cNvPicPr>
+                    <pic:cNvPr id="955633067" name="Picture 955633067"/>
+                    <pic:cNvPicPr/>
                   </pic:nvPicPr>
                   <pic:blipFill>
-                    <a:blip r:embed="rId6" cstate="print">
+                    <a:blip r:embed="rId6">
                       <a:extLst>
                         <a:ext uri="{28A0092B-C50C-407E-A947-70E740481C1C}">
                           <a14:useLocalDpi xmlns:a14="http://schemas.microsoft.com/office/drawing/2010/main" val="0"/>
                         </a:ext>
                       </a:extLst>
                     </a:blip>
-                    <a:srcRect/>
                     <a:stretch>
                       <a:fillRect/>
                     </a:stretch>
                   </pic:blipFill>
-                  <pic:spPr bwMode="auto">
+                  <pic:spPr>
                     <a:xfrm>
                       <a:off x="0" y="0"/>
-                      <a:ext cx="2649220" cy="3308350"/>
+                      <a:ext cx="2682240" cy="3672840"/>
                     </a:xfrm>
                     <a:prstGeom prst="rect">
                       <a:avLst/>
                     </a:prstGeom>
-                    <a:noFill/>
-                    <a:ln>
-                      <a:noFill/>
-                    </a:ln>
                   </pic:spPr>
                 </pic:pic>
               </a:graphicData>
             </a:graphic>
-            <wp14:sizeRelH relativeFrom="page">
-              <wp14:pctWidth>0</wp14:pctWidth>
-            </wp14:sizeRelH>
-            <wp14:sizeRelV relativeFrom="page">
-              <wp14:pctHeight>0</wp14:pctHeight>
-            </wp14:sizeRelV>
           </wp:anchor>
         </w:drawing>
       </w:r>
       <w:r>
-        <w:t xml:space="preserve">Part ABC is a component that pressure setting of </w:t>
+        <w:t>has a pressure</w:t>
+      </w:r>
+      <w:r>
+        <w:t xml:space="preserve"> setting of </w:t>
       </w:r>
       <w:r>
         <w:rPr>
@@ -116,7 +107,18 @@
         <w:t>35</w:t>
       </w:r>
       <w:r>
-        <w:t xml:space="preserve"> bar. This part is used to actuate the cylinders on the machine</w:t>
+        <w:t xml:space="preserve"> </w:t>
+      </w:r>
+      <w:proofErr w:type="gramStart"/>
+      <w:r>
+        <w:t>bar</w:t>
+      </w:r>
+      <w:proofErr w:type="gramEnd"/>
+      <w:r>
+        <w:t xml:space="preserve">. This part is used to </w:t>
+      </w:r>
+      <w:r>
+        <w:t>control the regulated circuit of a tractor.</w:t>
       </w:r>
     </w:p>
     <w:p>
@@ -841,6 +843,7 @@
   <w:style w:type="character" w:default="1" w:styleId="DefaultParagraphFont">
     <w:name w:val="Default Paragraph Font"/>
     <w:uiPriority w:val="1"/>
+    <w:semiHidden/>
     <w:unhideWhenUsed/>
   </w:style>
   <w:style w:type="table" w:default="1" w:styleId="TableNormal">

</xml_diff>